<commit_message>
feat: completely remove cover letter module from frontend, backend, AI service, and database
</commit_message>
<xml_diff>
--- a/CareerOS_Final_Project_Report.docx
+++ b/CareerOS_Final_Project_Report.docx
@@ -5,6 +5,77 @@
     <w:p>
       <w:pPr>
         <w:jc w:val="center"/>
+        <w:rPr>
+          <w:b/>
+          <w:color w:val="1E3A8A"/>
+          <w:sz w:val="36"/>
+        </w:rPr>
+      </w:pPr>
+      <w:r>
+        <w:rPr>
+          <w:b/>
+          <w:noProof/>
+          <w:sz w:val="20"/>
+        </w:rPr>
+        <w:drawing>
+          <wp:anchor distT="0" distB="0" distL="114300" distR="114300" simplePos="0" relativeHeight="251659264" behindDoc="0" locked="0" layoutInCell="1" allowOverlap="1" wp14:anchorId="1140CB5B" wp14:editId="18A251F6">
+            <wp:simplePos x="0" y="0"/>
+            <wp:positionH relativeFrom="column">
+              <wp:posOffset>807720</wp:posOffset>
+            </wp:positionH>
+            <wp:positionV relativeFrom="paragraph">
+              <wp:posOffset>-1905</wp:posOffset>
+            </wp:positionV>
+            <wp:extent cx="4320540" cy="1079500"/>
+            <wp:effectExtent l="0" t="0" r="3810" b="6350"/>
+            <wp:wrapTopAndBottom/>
+            <wp:docPr id="1" name="Image 1"/>
+            <wp:cNvGraphicFramePr/>
+            <a:graphic xmlns:a="http://schemas.openxmlformats.org/drawingml/2006/main">
+              <a:graphicData uri="http://schemas.openxmlformats.org/drawingml/2006/picture">
+                <pic:pic xmlns:pic="http://schemas.openxmlformats.org/drawingml/2006/picture">
+                  <pic:nvPicPr>
+                    <pic:cNvPr id="1" name="Image 1"/>
+                    <pic:cNvPicPr/>
+                  </pic:nvPicPr>
+                  <pic:blipFill>
+                    <a:blip r:embed="rId8" cstate="print"/>
+                    <a:stretch>
+                      <a:fillRect/>
+                    </a:stretch>
+                  </pic:blipFill>
+                  <pic:spPr>
+                    <a:xfrm>
+                      <a:off x="0" y="0"/>
+                      <a:ext cx="4320540" cy="1079500"/>
+                    </a:xfrm>
+                    <a:prstGeom prst="rect">
+                      <a:avLst/>
+                    </a:prstGeom>
+                  </pic:spPr>
+                </pic:pic>
+              </a:graphicData>
+            </a:graphic>
+          </wp:anchor>
+        </w:drawing>
+      </w:r>
+    </w:p>
+    <w:p>
+      <w:pPr>
+        <w:jc w:val="center"/>
+        <w:rPr>
+          <w:b/>
+          <w:color w:val="1E3A8A"/>
+          <w:sz w:val="36"/>
+        </w:rPr>
+      </w:pPr>
+    </w:p>
+    <w:p>
+      <w:pPr>
+        <w:jc w:val="center"/>
+        <w:rPr>
+          <w:i/>
+        </w:rPr>
       </w:pPr>
       <w:r>
         <w:rPr>
@@ -22,27 +93,17 @@
         </w:rPr>
         <w:br/>
       </w:r>
-    </w:p>
-    <w:p>
-      <w:pPr>
-        <w:jc w:val="center"/>
-        <w:rPr>
-          <w:i/>
-        </w:rPr>
-      </w:pPr>
-      <w:r>
-        <w:rPr>
-          <w:i/>
-        </w:rPr>
-        <w:t>A Project Report Submitted in Partial Fulfillment of the Requirements for the Degree of</w:t>
-      </w:r>
       <w:r>
         <w:rPr>
           <w:i/>
         </w:rPr>
         <w:br/>
-        <w:t>MASTER OF COMPUTER APPLICATIONS (MCA)</w:t>
-      </w:r>
+      </w:r>
+    </w:p>
+    <w:p>
+      <w:pPr>
+        <w:jc w:val="center"/>
+      </w:pPr>
       <w:r>
         <w:rPr>
           <w:i/>
@@ -53,17 +114,9 @@
     <w:p>
       <w:pPr>
         <w:jc w:val="center"/>
-      </w:pPr>
-      <w:r>
         <w:rPr>
-          <w:i/>
+          <w:sz w:val="22"/>
         </w:rPr>
-        <w:br/>
-      </w:r>
-    </w:p>
-    <w:p>
-      <w:pPr>
-        <w:jc w:val="center"/>
       </w:pPr>
       <w:r>
         <w:rPr>
@@ -71,6 +124,15 @@
         </w:rPr>
         <w:t>Submitted by:</w:t>
       </w:r>
+    </w:p>
+    <w:p>
+      <w:pPr>
+        <w:jc w:val="center"/>
+        <w:rPr>
+          <w:b/>
+          <w:sz w:val="26"/>
+        </w:rPr>
+      </w:pPr>
       <w:r>
         <w:rPr>
           <w:sz w:val="22"/>
@@ -90,7 +152,7 @@
           <w:sz w:val="26"/>
         </w:rPr>
         <w:br/>
-        <w:t xml:space="preserve">(Register No: </w:t>
+        <w:t xml:space="preserve">Register No: </w:t>
       </w:r>
       <w:r>
         <w:rPr>
@@ -104,7 +166,7 @@
           <w:b/>
           <w:sz w:val="26"/>
         </w:rPr>
-        <w:t>)</w:t>
+        <w:br/>
       </w:r>
       <w:r>
         <w:rPr>
@@ -116,13 +178,6 @@
       <w:r>
         <w:rPr>
           <w:b/>
-          <w:sz w:val="26"/>
-        </w:rPr>
-        <w:br/>
-      </w:r>
-      <w:r>
-        <w:rPr>
-          <w:b/>
         </w:rPr>
         <w:br/>
       </w:r>
@@ -149,22 +204,6 @@
           <w:color w:val="1E3A8A"/>
         </w:rPr>
         <w:t>DEPARTMENT OF COMPUTER SCIENCE</w:t>
-      </w:r>
-      <w:r>
-        <w:rPr>
-          <w:b/>
-          <w:color w:val="1E3A8A"/>
-        </w:rPr>
-        <w:br/>
-        <w:t>CHRIST (DEEMED TO BE UNIVERSITY)</w:t>
-      </w:r>
-      <w:r>
-        <w:rPr>
-          <w:b/>
-          <w:color w:val="1E3A8A"/>
-        </w:rPr>
-        <w:br/>
-        <w:t>DELHI NCR CAMPUS, INDIA</w:t>
       </w:r>
       <w:r>
         <w:rPr>
@@ -276,34 +315,7 @@
       </w:r>
       <w:r>
         <w:br/>
-        <w:t>References .................................................................................................................................... 103</w:t>
-      </w:r>
-      <w:r>
-        <w:br/>
-        <w:t>Appendices A–F ........................................................................................................................... 106</w:t>
-      </w:r>
-      <w:r>
-        <w:br/>
-        <w:t>Screenshot Plan ........................................................................................................................... 114</w:t>
-      </w:r>
-      <w:r>
-        <w:br/>
-        <w:t>Viva Preparation Notes .............................................................................................................. 116</w:t>
-      </w:r>
-      <w:r>
-        <w:br/>
-        <w:t>Demo Support Sequence ........................................................................................................... 122</w:t>
-      </w:r>
-      <w:r>
-        <w:br/>
-      </w:r>
-      <w:r>
-        <w:lastRenderedPageBreak/>
-        <w:t>Rubric Mapping Table ................................................................................................................. 124</w:t>
-      </w:r>
-      <w:r>
-        <w:br/>
-        <w:t>Manual Confirmation Checklist .............................................................................................. 126</w:t>
+        <w:t>References .................................................................................................................................. 103</w:t>
       </w:r>
       <w:r>
         <w:br/>
@@ -3785,7 +3797,6 @@
     </w:tbl>
     <w:p>
       <w:r>
-        <w:lastRenderedPageBreak/>
         <w:br w:type="page"/>
       </w:r>
     </w:p>
@@ -6012,8 +6023,8 @@
     </w:p>
     <w:p/>
     <w:sectPr>
-      <w:headerReference w:type="default" r:id="rId8"/>
-      <w:footerReference w:type="default" r:id="rId9"/>
+      <w:headerReference w:type="default" r:id="rId9"/>
+      <w:footerReference w:type="default" r:id="rId10"/>
       <w:pgSz w:w="12240" w:h="15840"/>
       <w:pgMar w:top="1440" w:right="1440" w:bottom="1440" w:left="1440" w:header="720" w:footer="720" w:gutter="0"/>
       <w:cols w:space="720"/>

</xml_diff>